<commit_message>
fix(podes, dda): update Pj. Kepala Desa Sungai Bakau Kecil signee to Agus Junaidi
</commit_message>
<xml_diff>
--- a/kegiatan/desa-cantik/2026/sungai-bakau-kecil/publikasi-potensi-sungai-bakau-kecil-2026.docx
+++ b/kegiatan/desa-cantik/2026/sungai-bakau-kecil/publikasi-potensi-sungai-bakau-kecil-2026.docx
@@ -1671,7 +1671,7 @@
           <w:color w:val="0B3C5D"/>
           <w:sz w:val="19"/>
         </w:rPr>
-        <w:t>PLT. KEPALA DESA SUNGAI BAKAU KECIL</w:t>
+        <w:t>PJ. KEPALA DESA SUNGAI BAKAU KECIL</w:t>
       </w:r>
     </w:p>
     <w:tbl>
@@ -1679,7 +1679,7 @@
         <w:tblW w:type="auto" w:w="0"/>
         <w:tblLayout w:type="fixed"/>
         <w:tblLook w:firstColumn="1" w:firstRow="1" w:lastColumn="0" w:lastRow="0" w:noHBand="0" w:noVBand="1" w:val="04A0"/>
-        <w:tblInd w:w="3800.0" w:type="dxa"/>
+        <w:tblInd w:w="3900.0" w:type="dxa"/>
       </w:tblPr>
       <w:tblGrid>
         <w:gridCol w:w="9019"/>
@@ -1690,7 +1690,7 @@
         </w:trPr>
         <w:tc>
           <w:tcPr>
-            <w:tcW w:type="dxa" w:w="6840"/>
+            <w:tcW w:type="dxa" w:w="6700"/>
             <w:tcBorders/>
             <w:shd w:fill="f7fafb"/>
             <w:tcMar>
@@ -1704,7 +1704,7 @@
               <w:autoSpaceDE w:val="0"/>
               <w:widowControl/>
               <w:spacing w:line="235" w:lineRule="auto" w:before="60" w:after="0"/>
-              <w:ind w:left="0" w:right="1222" w:firstLine="0"/>
+              <w:ind w:left="0" w:right="1284" w:firstLine="0"/>
               <w:jc w:val="right"/>
             </w:pPr>
             <w:r>
@@ -1716,7 +1716,7 @@
                 <w:color w:val="0B3C5D"/>
                 <w:sz w:val="21"/>
               </w:rPr>
-              <w:t>RIANDI PRAYUDA</w:t>
+              <w:t>AGUS JUNAIDI</w:t>
             </w:r>
           </w:p>
         </w:tc>
@@ -2004,7 +2004,7 @@
         <w:tblW w:type="auto" w:w="0"/>
         <w:tblLayout w:type="fixed"/>
         <w:tblLook w:firstColumn="1" w:firstRow="1" w:lastColumn="0" w:lastRow="0" w:noHBand="0" w:noVBand="1" w:val="04A0"/>
-        <w:tblInd w:w="3620.0" w:type="dxa"/>
+        <w:tblInd w:w="3680.0" w:type="dxa"/>
       </w:tblPr>
       <w:tblGrid>
         <w:gridCol w:w="9019"/>
@@ -2015,7 +2015,7 @@
         </w:trPr>
         <w:tc>
           <w:tcPr>
-            <w:tcW w:type="dxa" w:w="6840"/>
+            <w:tcW w:type="dxa" w:w="6700"/>
             <w:tcBorders/>
             <w:shd w:fill="f7fafb"/>
             <w:tcMar>
@@ -2029,7 +2029,7 @@
               <w:autoSpaceDE w:val="0"/>
               <w:widowControl/>
               <w:spacing w:line="233" w:lineRule="auto" w:before="60" w:after="0"/>
-              <w:ind w:left="0" w:right="1416" w:firstLine="0"/>
+              <w:ind w:left="0" w:right="1482" w:firstLine="0"/>
               <w:jc w:val="right"/>
             </w:pPr>
             <w:r>
@@ -2041,7 +2041,7 @@
                 <w:color w:val="0B3C5D"/>
                 <w:sz w:val="21"/>
               </w:rPr>
-              <w:t>RIANDI PRAYUDA</w:t>
+              <w:t>AGUS JUNAIDI</w:t>
             </w:r>
           </w:p>
         </w:tc>

</xml_diff>